<commit_message>
Battaglia et al. is a required Week 5 reading; Lecture 5 gets an intuition slide for the estimated-regressor argument
Co-Authored-By: Claude Fable 5.1 <noreply@anthropic.com>
</commit_message>
<xml_diff>
--- a/syllabus/mkt-699-Fall2026-revised.docx
+++ b/syllabus/mkt-699-Fall2026-revised.docx
@@ -1385,6 +1385,16 @@
         </w:numPr>
         <w:pStyle w:val="Compact"/>
       </w:pPr>
+      <w:r>
+        <w:rPr>
+          <w:bCs/>
+          <w:b/>
+        </w:rPr>
+        <w:t xml:space="preserve">Required:</w:t>
+      </w:r>
+      <w:r>
+        <w:t xml:space="preserve"> </w:t>
+      </w:r>
       <w:r>
         <w:t xml:space="preserve">Battaglia, L., Christensen, T., Hansen, S., &amp; Sacher, S. Inference for regression with variables generated by AI or machine learning.</w:t>
       </w:r>

</xml_diff>

<commit_message>
Assignment 2 is now a paper presentation in Week 5, one paper per student; measurement assignment retired
Co-Authored-By: Claude Fable 5.1 <noreply@anthropic.com>
</commit_message>
<xml_diff>
--- a/syllabus/mkt-699-Fall2026-revised.docx
+++ b/syllabus/mkt-699-Fall2026-revised.docx
@@ -849,7 +849,7 @@
           <w:iCs/>
           <w:i/>
         </w:rPr>
-        <w:t xml:space="preserve">Assignment 1 due. Assignment 2 released: measurement and validation exercise (due Week 6).</w:t>
+        <w:t xml:space="preserve">Assignment 1 due. Assignment 2 released: each student presents one of the Week 5 papers, in class on Sep 23.</w:t>
       </w:r>
     </w:p>
     <w:p>
@@ -1247,6 +1247,18 @@
           <w:iCs/>
           <w:i/>
         </w:rPr>
+        <w:t xml:space="preserve">Assignment 2: paper presentations in class, 15 minutes each.</w:t>
+      </w:r>
+    </w:p>
+    <w:p>
+      <w:pPr>
+        <w:pStyle w:val="BodyText"/>
+      </w:pPr>
+      <w:r>
+        <w:rPr>
+          <w:iCs/>
+          <w:i/>
+        </w:rPr>
         <w:t xml:space="preserve">Papers:</w:t>
       </w:r>
     </w:p>
@@ -1621,18 +1633,6 @@
     <w:p>
       <w:pPr>
         <w:pStyle w:val="FirstParagraph"/>
-      </w:pPr>
-      <w:r>
-        <w:rPr>
-          <w:iCs/>
-          <w:i/>
-        </w:rPr>
-        <w:t xml:space="preserve">Assignment 2 due.</w:t>
-      </w:r>
-    </w:p>
-    <w:p>
-      <w:pPr>
-        <w:pStyle w:val="BodyText"/>
       </w:pPr>
       <w:r>
         <w:rPr>
@@ -3462,7 +3462,14 @@
               <w:jc w:val="left"/>
             </w:pPr>
             <w:r>
-              <w:t xml:space="preserve">Validation complete</w:t>
+              <w:rPr>
+                <w:bCs/>
+                <w:b/>
+              </w:rPr>
+              <w:t xml:space="preserve">Assignment 2: paper presentations</w:t>
+            </w:r>
+            <w:r>
+              <w:t xml:space="preserve">; validation complete</w:t>
             </w:r>
           </w:p>
         </w:tc>
@@ -3519,14 +3526,7 @@
               <w:jc w:val="left"/>
             </w:pPr>
             <w:r>
-              <w:rPr>
-                <w:bCs/>
-                <w:b/>
-              </w:rPr>
-              <w:t xml:space="preserve">Assignment 2 due</w:t>
-            </w:r>
-            <w:r>
-              <w:t xml:space="preserve">; revised identification memo</w:t>
+              <w:t xml:space="preserve">Revised identification memo</w:t>
             </w:r>
           </w:p>
         </w:tc>
@@ -5577,31 +5577,69 @@
               <w:jc w:val="left"/>
             </w:pPr>
             <w:r>
-              <w:t xml:space="preserve">2 Programming assignments</w:t>
-            </w:r>
-          </w:p>
-        </w:tc>
-        <w:tc>
-          <w:tcPr/>
-          <w:p>
-            <w:pPr>
-              <w:pStyle w:val="Compact"/>
-              <w:jc w:val="left"/>
-            </w:pPr>
-            <w:r>
-              <w:t xml:space="preserve">20</w:t>
-            </w:r>
-          </w:p>
-        </w:tc>
-        <w:tc>
-          <w:tcPr/>
-          <w:p>
-            <w:pPr>
-              <w:pStyle w:val="Compact"/>
-              <w:jc w:val="left"/>
-            </w:pPr>
-            <w:r>
-              <w:t xml:space="preserve">20%</w:t>
+              <w:t xml:space="preserve">Assignment 1, programming</w:t>
+            </w:r>
+          </w:p>
+        </w:tc>
+        <w:tc>
+          <w:tcPr/>
+          <w:p>
+            <w:pPr>
+              <w:pStyle w:val="Compact"/>
+              <w:jc w:val="left"/>
+            </w:pPr>
+            <w:r>
+              <w:t xml:space="preserve">10</w:t>
+            </w:r>
+          </w:p>
+        </w:tc>
+        <w:tc>
+          <w:tcPr/>
+          <w:p>
+            <w:pPr>
+              <w:pStyle w:val="Compact"/>
+              <w:jc w:val="left"/>
+            </w:pPr>
+            <w:r>
+              <w:t xml:space="preserve">10%</w:t>
+            </w:r>
+          </w:p>
+        </w:tc>
+      </w:tr>
+      <w:tr>
+        <w:tc>
+          <w:tcPr/>
+          <w:p>
+            <w:pPr>
+              <w:pStyle w:val="Compact"/>
+              <w:jc w:val="left"/>
+            </w:pPr>
+            <w:r>
+              <w:t xml:space="preserve">Assignment 2, paper presentation</w:t>
+            </w:r>
+          </w:p>
+        </w:tc>
+        <w:tc>
+          <w:tcPr/>
+          <w:p>
+            <w:pPr>
+              <w:pStyle w:val="Compact"/>
+              <w:jc w:val="left"/>
+            </w:pPr>
+            <w:r>
+              <w:t xml:space="preserve">10</w:t>
+            </w:r>
+          </w:p>
+        </w:tc>
+        <w:tc>
+          <w:tcPr/>
+          <w:p>
+            <w:pPr>
+              <w:pStyle w:val="Compact"/>
+              <w:jc w:val="left"/>
+            </w:pPr>
+            <w:r>
+              <w:t xml:space="preserve">10%</w:t>
             </w:r>
           </w:p>
         </w:tc>

</xml_diff>

<commit_message>
Week 5 readings: add Dell & Rambachan (2026), NBER WP 35744
Co-Authored-By: Claude Fable 5.1 <noreply@anthropic.com>
</commit_message>
<xml_diff>
--- a/syllabus/mkt-699-Fall2026-revised.docx
+++ b/syllabus/mkt-699-Fall2026-revised.docx
@@ -1352,6 +1352,28 @@
       </w:r>
       <w:r>
         <w:t xml:space="preserve">Ludwig, J., Mullainathan, S., &amp; Rambachan, A. (2025). Large language models: An applied econometric framework. NBER Working Paper No. 33344. [Working paper]</w:t>
+      </w:r>
+    </w:p>
+    <w:p>
+      <w:pPr>
+        <w:numPr>
+          <w:ilvl w:val="0"/>
+          <w:numId w:val="1008"/>
+        </w:numPr>
+        <w:pStyle w:val="Compact"/>
+      </w:pPr>
+      <w:r>
+        <w:rPr>
+          <w:bCs/>
+          <w:b/>
+        </w:rPr>
+        <w:t xml:space="preserve">Required:</w:t>
+      </w:r>
+      <w:r>
+        <w:t xml:space="preserve"> </w:t>
+      </w:r>
+      <w:r>
+        <w:t xml:space="preserve">Dell, M., &amp; Rambachan, A. (2026). The measurement revolution? Credible measurement and inference in the age of AI. NBER Working Paper No. 35744. [Working paper]</w:t>
       </w:r>
     </w:p>
     <w:p>

</xml_diff>